<commit_message>
kubernetes - files update
</commit_message>
<xml_diff>
--- a/Kubernetes/14-scheduling.docx
+++ b/Kubernetes/14-scheduling.docx
@@ -450,6 +450,7 @@
         </w:rPr>
         <w:t xml:space="preserve">In contrast, </w:t>
       </w:r>
+      <w:proofErr w:type="gramStart"/>
       <w:r>
         <w:rPr>
           <w:rFonts w:asciiTheme="majorBidi" w:hAnsiTheme="majorBidi" w:cstheme="majorBidi"/>
@@ -468,7 +469,18 @@
           <w:sz w:val="28"/>
           <w:szCs w:val="28"/>
         </w:rPr>
-        <w:t>oft constraints</w:t>
+        <w:t>oft</w:t>
+      </w:r>
+      <w:proofErr w:type="gramEnd"/>
+      <w:r>
+        <w:rPr>
+          <w:rFonts w:asciiTheme="majorBidi" w:hAnsiTheme="majorBidi" w:cstheme="majorBidi"/>
+          <w:b/>
+          <w:bCs/>
+          <w:sz w:val="28"/>
+          <w:szCs w:val="28"/>
+        </w:rPr>
+        <w:t xml:space="preserve"> constraints</w:t>
       </w:r>
       <w:r>
         <w:rPr>
@@ -1315,7 +1327,25 @@
           <w:sz w:val="28"/>
           <w:szCs w:val="28"/>
         </w:rPr>
-        <w:t>are eligible to run this Pod.</w:t>
+        <w:t xml:space="preserve">are eligible to run </w:t>
+      </w:r>
+      <w:proofErr w:type="gramStart"/>
+      <w:r>
+        <w:rPr>
+          <w:rFonts w:asciiTheme="majorBidi" w:hAnsiTheme="majorBidi" w:cstheme="majorBidi"/>
+          <w:sz w:val="28"/>
+          <w:szCs w:val="28"/>
+        </w:rPr>
+        <w:t>this</w:t>
+      </w:r>
+      <w:proofErr w:type="gramEnd"/>
+      <w:r>
+        <w:rPr>
+          <w:rFonts w:asciiTheme="majorBidi" w:hAnsiTheme="majorBidi" w:cstheme="majorBidi"/>
+          <w:sz w:val="28"/>
+          <w:szCs w:val="28"/>
+        </w:rPr>
+        <w:t xml:space="preserve"> Pod.</w:t>
       </w:r>
     </w:p>
     <w:p>
@@ -9830,13 +9860,23 @@
         </w:rPr>
         <w:t xml:space="preserve"> </w:t>
       </w:r>
-      <w:r>
-        <w:rPr>
-          <w:rFonts w:asciiTheme="majorBidi" w:hAnsiTheme="majorBidi" w:cstheme="majorBidi"/>
-          <w:sz w:val="28"/>
-          <w:szCs w:val="28"/>
-        </w:rPr>
-        <w:t>So weight directly affects how strongly the scheduler prefers nodes that match that rule.</w:t>
+      <w:proofErr w:type="gramStart"/>
+      <w:r>
+        <w:rPr>
+          <w:rFonts w:asciiTheme="majorBidi" w:hAnsiTheme="majorBidi" w:cstheme="majorBidi"/>
+          <w:sz w:val="28"/>
+          <w:szCs w:val="28"/>
+        </w:rPr>
+        <w:t>So</w:t>
+      </w:r>
+      <w:proofErr w:type="gramEnd"/>
+      <w:r>
+        <w:rPr>
+          <w:rFonts w:asciiTheme="majorBidi" w:hAnsiTheme="majorBidi" w:cstheme="majorBidi"/>
+          <w:sz w:val="28"/>
+          <w:szCs w:val="28"/>
+        </w:rPr>
+        <w:t xml:space="preserve"> weight directly affects how strongly the scheduler prefers nodes that match that rule.</w:t>
       </w:r>
     </w:p>
     <w:p>
@@ -11921,6 +11961,7 @@
     </w:p>
     <w:p>
       <w:pPr>
+        <w:spacing w:after="120"/>
         <w:jc w:val="both"/>
         <w:rPr>
           <w:rFonts w:asciiTheme="majorBidi" w:hAnsiTheme="majorBidi" w:cstheme="majorBidi"/>
@@ -11953,6 +11994,7 @@
     </w:p>
     <w:p>
       <w:pPr>
+        <w:spacing w:after="60"/>
         <w:jc w:val="both"/>
         <w:rPr>
           <w:rFonts w:asciiTheme="majorBidi" w:hAnsiTheme="majorBidi" w:cstheme="majorBidi"/>
@@ -13093,7 +13135,25 @@
           <w:sz w:val="28"/>
           <w:szCs w:val="28"/>
         </w:rPr>
-        <w:t>This effectively blocks GPU nodes from hosting this Pod.</w:t>
+        <w:t xml:space="preserve">This effectively blocks GPU nodes from hosting </w:t>
+      </w:r>
+      <w:proofErr w:type="gramStart"/>
+      <w:r>
+        <w:rPr>
+          <w:rFonts w:asciiTheme="majorBidi" w:hAnsiTheme="majorBidi" w:cstheme="majorBidi"/>
+          <w:sz w:val="28"/>
+          <w:szCs w:val="28"/>
+        </w:rPr>
+        <w:t>this</w:t>
+      </w:r>
+      <w:proofErr w:type="gramEnd"/>
+      <w:r>
+        <w:rPr>
+          <w:rFonts w:asciiTheme="majorBidi" w:hAnsiTheme="majorBidi" w:cstheme="majorBidi"/>
+          <w:sz w:val="28"/>
+          <w:szCs w:val="28"/>
+        </w:rPr>
+        <w:t xml:space="preserve"> Pod.</w:t>
       </w:r>
     </w:p>
     <w:p>
@@ -19942,7 +20002,7 @@
     </w:p>
     <w:p>
       <w:pPr>
-        <w:spacing w:after="120"/>
+        <w:spacing w:after="60"/>
         <w:jc w:val="both"/>
         <w:rPr>
           <w:rFonts w:asciiTheme="majorBidi" w:hAnsiTheme="majorBidi" w:cstheme="majorBidi"/>
@@ -20132,6 +20192,7 @@
     </w:p>
     <w:p>
       <w:pPr>
+        <w:spacing w:after="60"/>
         <w:jc w:val="both"/>
         <w:rPr>
           <w:rFonts w:asciiTheme="majorBidi" w:hAnsiTheme="majorBidi" w:cstheme="majorBidi"/>
@@ -21737,6 +21798,7 @@
     </w:p>
     <w:p>
       <w:pPr>
+        <w:spacing w:after="60"/>
         <w:jc w:val="both"/>
         <w:rPr>
           <w:rFonts w:asciiTheme="majorBidi" w:hAnsiTheme="majorBidi" w:cstheme="majorBidi"/>
@@ -22593,13 +22655,23 @@
         </w:rPr>
         <w:t xml:space="preserve"> </w:t>
       </w:r>
-      <w:r>
-        <w:rPr>
-          <w:rFonts w:asciiTheme="majorBidi" w:hAnsiTheme="majorBidi" w:cstheme="majorBidi"/>
-          <w:sz w:val="28"/>
-          <w:szCs w:val="28"/>
-        </w:rPr>
-        <w:t>So you use Pod Anti‑Affinity like this:</w:t>
+      <w:proofErr w:type="gramStart"/>
+      <w:r>
+        <w:rPr>
+          <w:rFonts w:asciiTheme="majorBidi" w:hAnsiTheme="majorBidi" w:cstheme="majorBidi"/>
+          <w:sz w:val="28"/>
+          <w:szCs w:val="28"/>
+        </w:rPr>
+        <w:t>So</w:t>
+      </w:r>
+      <w:proofErr w:type="gramEnd"/>
+      <w:r>
+        <w:rPr>
+          <w:rFonts w:asciiTheme="majorBidi" w:hAnsiTheme="majorBidi" w:cstheme="majorBidi"/>
+          <w:sz w:val="28"/>
+          <w:szCs w:val="28"/>
+        </w:rPr>
+        <w:t xml:space="preserve"> you use Pod Anti‑Affinity like this:</w:t>
       </w:r>
     </w:p>
     <w:p>
@@ -23075,6 +23147,7 @@
           <w:ilvl w:val="0"/>
           <w:numId w:val="44"/>
         </w:numPr>
+        <w:spacing w:after="120"/>
         <w:ind w:left="360"/>
         <w:jc w:val="both"/>
         <w:rPr>
@@ -23196,16 +23269,16 @@
         <mc:AlternateContent>
           <mc:Choice Requires="wps">
             <w:drawing>
-              <wp:anchor distT="0" distB="0" distL="114300" distR="114300" simplePos="0" relativeHeight="251675648" behindDoc="0" locked="0" layoutInCell="1" allowOverlap="1" wp14:anchorId="3C44563A" wp14:editId="4E9FEB5B">
+              <wp:anchor distT="0" distB="0" distL="114300" distR="114300" simplePos="0" relativeHeight="251675648" behindDoc="0" locked="0" layoutInCell="1" allowOverlap="1" wp14:anchorId="3C44563A" wp14:editId="6E7F153A">
                 <wp:simplePos x="0" y="0"/>
                 <wp:positionH relativeFrom="column">
-                  <wp:posOffset>242456</wp:posOffset>
+                  <wp:posOffset>243840</wp:posOffset>
                 </wp:positionH>
                 <wp:positionV relativeFrom="paragraph">
                   <wp:posOffset>0</wp:posOffset>
                 </wp:positionV>
-                <wp:extent cx="4398818" cy="1981200"/>
-                <wp:effectExtent l="0" t="0" r="20955" b="19050"/>
+                <wp:extent cx="4398818" cy="1988820"/>
+                <wp:effectExtent l="0" t="0" r="20955" b="11430"/>
                 <wp:wrapNone/>
                 <wp:docPr id="1181839318" name="Rectangle 17"/>
                 <wp:cNvGraphicFramePr/>
@@ -23216,7 +23289,7 @@
                       <wps:spPr>
                         <a:xfrm>
                           <a:off x="0" y="0"/>
-                          <a:ext cx="4398818" cy="1981200"/>
+                          <a:ext cx="4398818" cy="1988820"/>
                         </a:xfrm>
                         <a:prstGeom prst="rect">
                           <a:avLst/>
@@ -23561,6 +23634,18 @@
                                 <w:sz w:val="28"/>
                                 <w:szCs w:val="28"/>
                               </w:rPr>
+                              <w:t xml:space="preserve">     </w:t>
+                            </w:r>
+                            <w:r>
+                              <w:rPr>
+                                <w:rFonts w:asciiTheme="majorBidi" w:hAnsiTheme="majorBidi" w:cstheme="majorBidi"/>
+                                <w:b/>
+                                <w:bCs/>
+                                <w:i/>
+                                <w:iCs/>
+                                <w:sz w:val="28"/>
+                                <w:szCs w:val="28"/>
+                              </w:rPr>
                               <w:t>app: backend</w:t>
                             </w:r>
                           </w:p>
@@ -23642,12 +23727,15 @@
                 <wp14:sizeRelH relativeFrom="margin">
                   <wp14:pctWidth>0</wp14:pctWidth>
                 </wp14:sizeRelH>
+                <wp14:sizeRelV relativeFrom="margin">
+                  <wp14:pctHeight>0</wp14:pctHeight>
+                </wp14:sizeRelV>
               </wp:anchor>
             </w:drawing>
           </mc:Choice>
           <mc:Fallback>
             <w:pict>
-              <v:rect w14:anchorId="3C44563A" id="Rectangle 17" o:spid="_x0000_s1042" style="position:absolute;left:0;text-align:left;margin-left:19.1pt;margin-top:0;width:346.35pt;height:156pt;z-index:251675648;visibility:visible;mso-wrap-style:square;mso-width-percent:0;mso-wrap-distance-left:9pt;mso-wrap-distance-top:0;mso-wrap-distance-right:9pt;mso-wrap-distance-bottom:0;mso-position-horizontal:absolute;mso-position-horizontal-relative:text;mso-position-vertical:absolute;mso-position-vertical-relative:text;mso-width-percent:0;mso-width-relative:margin;v-text-anchor:middle" o:gfxdata="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" fillcolor="black [3200]" strokecolor="black [480]" strokeweight="1pt">
+              <v:rect w14:anchorId="3C44563A" id="Rectangle 17" o:spid="_x0000_s1042" style="position:absolute;left:0;text-align:left;margin-left:19.2pt;margin-top:0;width:346.35pt;height:156.6pt;z-index:251675648;visibility:visible;mso-wrap-style:square;mso-width-percent:0;mso-height-percent:0;mso-wrap-distance-left:9pt;mso-wrap-distance-top:0;mso-wrap-distance-right:9pt;mso-wrap-distance-bottom:0;mso-position-horizontal:absolute;mso-position-horizontal-relative:text;mso-position-vertical:absolute;mso-position-vertical-relative:text;mso-width-percent:0;mso-height-percent:0;mso-width-relative:margin;mso-height-relative:margin;v-text-anchor:middle" o:gfxdata="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" fillcolor="black [3200]" strokecolor="black [480]" strokeweight="1pt">
                 <v:textbox>
                   <w:txbxContent>
                     <w:p>
@@ -23960,6 +24048,18 @@
                           <w:szCs w:val="28"/>
                         </w:rPr>
                         <w:t xml:space="preserve">                    </w:t>
+                      </w:r>
+                      <w:r>
+                        <w:rPr>
+                          <w:rFonts w:asciiTheme="majorBidi" w:hAnsiTheme="majorBidi" w:cstheme="majorBidi"/>
+                          <w:b/>
+                          <w:bCs/>
+                          <w:i/>
+                          <w:iCs/>
+                          <w:sz w:val="28"/>
+                          <w:szCs w:val="28"/>
+                        </w:rPr>
+                        <w:t xml:space="preserve">     </w:t>
                       </w:r>
                       <w:r>
                         <w:rPr>
@@ -24098,6 +24198,7 @@
     </w:p>
     <w:p>
       <w:pPr>
+        <w:spacing w:after="120"/>
         <w:ind w:left="360"/>
         <w:jc w:val="both"/>
         <w:rPr>
@@ -25435,7 +25536,7 @@
     </w:p>
     <w:p>
       <w:pPr>
-        <w:spacing w:after="120"/>
+        <w:spacing w:after="60"/>
         <w:jc w:val="both"/>
         <w:rPr>
           <w:rFonts w:asciiTheme="majorBidi" w:hAnsiTheme="majorBidi" w:cstheme="majorBidi"/>
@@ -25475,6 +25576,7 @@
     </w:p>
     <w:p>
       <w:pPr>
+        <w:spacing w:after="80"/>
         <w:jc w:val="both"/>
         <w:rPr>
           <w:rFonts w:asciiTheme="majorBidi" w:hAnsiTheme="majorBidi" w:cstheme="majorBidi"/>
@@ -27196,7 +27298,25 @@
           <w:sz w:val="28"/>
           <w:szCs w:val="28"/>
         </w:rPr>
-        <w:t xml:space="preserve"> is the most strict method.</w:t>
+        <w:t xml:space="preserve"> is the </w:t>
+      </w:r>
+      <w:proofErr w:type="gramStart"/>
+      <w:r>
+        <w:rPr>
+          <w:rFonts w:asciiTheme="majorBidi" w:hAnsiTheme="majorBidi" w:cstheme="majorBidi"/>
+          <w:sz w:val="28"/>
+          <w:szCs w:val="28"/>
+        </w:rPr>
+        <w:t>most strict</w:t>
+      </w:r>
+      <w:proofErr w:type="gramEnd"/>
+      <w:r>
+        <w:rPr>
+          <w:rFonts w:asciiTheme="majorBidi" w:hAnsiTheme="majorBidi" w:cstheme="majorBidi"/>
+          <w:sz w:val="28"/>
+          <w:szCs w:val="28"/>
+        </w:rPr>
+        <w:t xml:space="preserve"> method.</w:t>
       </w:r>
     </w:p>
     <w:p>
@@ -28591,6 +28711,7 @@
         <w:t>key=</w:t>
       </w:r>
       <w:proofErr w:type="spellStart"/>
+      <w:proofErr w:type="gramStart"/>
       <w:r>
         <w:rPr>
           <w:rFonts w:asciiTheme="majorBidi" w:hAnsiTheme="majorBidi" w:cstheme="majorBidi"/>
@@ -28604,6 +28725,7 @@
         <w:t>value:effect</w:t>
       </w:r>
       <w:proofErr w:type="spellEnd"/>
+      <w:proofErr w:type="gramEnd"/>
     </w:p>
     <w:p>
       <w:pPr>
@@ -28652,6 +28774,7 @@
         <w:t>role=</w:t>
       </w:r>
       <w:proofErr w:type="spellStart"/>
+      <w:proofErr w:type="gramStart"/>
       <w:r>
         <w:rPr>
           <w:rFonts w:asciiTheme="majorBidi" w:hAnsiTheme="majorBidi" w:cstheme="majorBidi"/>
@@ -28665,6 +28788,7 @@
         <w:t>db:NoSchedule</w:t>
       </w:r>
       <w:proofErr w:type="spellEnd"/>
+      <w:proofErr w:type="gramEnd"/>
     </w:p>
     <w:p>
       <w:pPr>
@@ -28928,7 +29052,7 @@
     </w:p>
     <w:p>
       <w:pPr>
-        <w:spacing w:after="120"/>
+        <w:spacing w:after="60"/>
         <w:jc w:val="both"/>
         <w:rPr>
           <w:rFonts w:asciiTheme="majorBidi" w:hAnsiTheme="majorBidi" w:cstheme="majorBidi"/>
@@ -28982,6 +29106,7 @@
     </w:p>
     <w:p>
       <w:pPr>
+        <w:spacing w:after="120"/>
         <w:jc w:val="both"/>
         <w:rPr>
           <w:rFonts w:asciiTheme="majorBidi" w:hAnsiTheme="majorBidi" w:cstheme="majorBidi"/>
@@ -29020,6 +29145,7 @@
         <w:t xml:space="preserve"> taint node node1 key=</w:t>
       </w:r>
       <w:proofErr w:type="spellStart"/>
+      <w:proofErr w:type="gramStart"/>
       <w:r>
         <w:rPr>
           <w:rFonts w:asciiTheme="majorBidi" w:hAnsiTheme="majorBidi" w:cstheme="majorBidi"/>
@@ -29033,6 +29159,7 @@
         <w:t>value:NoSchedule</w:t>
       </w:r>
       <w:proofErr w:type="spellEnd"/>
+      <w:proofErr w:type="gramEnd"/>
     </w:p>
     <w:p>
       <w:pPr>
@@ -29059,6 +29186,7 @@
     </w:p>
     <w:p>
       <w:pPr>
+        <w:spacing w:after="120"/>
         <w:jc w:val="both"/>
         <w:rPr>
           <w:rFonts w:asciiTheme="majorBidi" w:hAnsiTheme="majorBidi" w:cstheme="majorBidi"/>
@@ -29113,7 +29241,7 @@
     </w:p>
     <w:p>
       <w:pPr>
-        <w:spacing w:after="120"/>
+        <w:spacing w:after="60"/>
         <w:jc w:val="both"/>
         <w:rPr>
           <w:rFonts w:asciiTheme="majorBidi" w:hAnsiTheme="majorBidi" w:cstheme="majorBidi"/>
@@ -29212,16 +29340,16 @@
         <mc:AlternateContent>
           <mc:Choice Requires="wps">
             <w:drawing>
-              <wp:anchor distT="0" distB="0" distL="114300" distR="114300" simplePos="0" relativeHeight="251678720" behindDoc="0" locked="0" layoutInCell="1" allowOverlap="1" wp14:anchorId="521B56D4" wp14:editId="30BC26F0">
+              <wp:anchor distT="0" distB="0" distL="114300" distR="114300" simplePos="0" relativeHeight="251678720" behindDoc="0" locked="0" layoutInCell="1" allowOverlap="1" wp14:anchorId="521B56D4" wp14:editId="4B27428B">
                 <wp:simplePos x="0" y="0"/>
-                <wp:positionH relativeFrom="column">
-                  <wp:posOffset>-20782</wp:posOffset>
+                <wp:positionH relativeFrom="margin">
+                  <wp:align>left</wp:align>
                 </wp:positionH>
                 <wp:positionV relativeFrom="paragraph">
-                  <wp:posOffset>319636</wp:posOffset>
+                  <wp:posOffset>319405</wp:posOffset>
                 </wp:positionV>
-                <wp:extent cx="2195946" cy="1274618"/>
-                <wp:effectExtent l="0" t="0" r="13970" b="20955"/>
+                <wp:extent cx="2180590" cy="1274618"/>
+                <wp:effectExtent l="0" t="0" r="10160" b="20955"/>
                 <wp:wrapNone/>
                 <wp:docPr id="1120064713" name="Rectangle 20"/>
                 <wp:cNvGraphicFramePr/>
@@ -29232,7 +29360,7 @@
                       <wps:spPr>
                         <a:xfrm>
                           <a:off x="0" y="0"/>
-                          <a:ext cx="2195946" cy="1274618"/>
+                          <a:ext cx="2180590" cy="1274618"/>
                         </a:xfrm>
                         <a:prstGeom prst="rect">
                           <a:avLst/>
@@ -29494,7 +29622,7 @@
           </mc:Choice>
           <mc:Fallback>
             <w:pict>
-              <v:rect w14:anchorId="521B56D4" id="Rectangle 20" o:spid="_x0000_s1045" style="position:absolute;left:0;text-align:left;margin-left:-1.65pt;margin-top:25.15pt;width:172.9pt;height:100.35pt;z-index:251678720;visibility:visible;mso-wrap-style:square;mso-width-percent:0;mso-height-percent:0;mso-wrap-distance-left:9pt;mso-wrap-distance-top:0;mso-wrap-distance-right:9pt;mso-wrap-distance-bottom:0;mso-position-horizontal:absolute;mso-position-horizontal-relative:text;mso-position-vertical:absolute;mso-position-vertical-relative:text;mso-width-percent:0;mso-height-percent:0;mso-width-relative:margin;mso-height-relative:margin;v-text-anchor:middle" o:gfxdata="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" fillcolor="black [3200]" strokecolor="black [480]" strokeweight="1pt">
+              <v:rect w14:anchorId="521B56D4" id="Rectangle 20" o:spid="_x0000_s1045" style="position:absolute;left:0;text-align:left;margin-left:0;margin-top:25.15pt;width:171.7pt;height:100.35pt;z-index:251678720;visibility:visible;mso-wrap-style:square;mso-width-percent:0;mso-height-percent:0;mso-wrap-distance-left:9pt;mso-wrap-distance-top:0;mso-wrap-distance-right:9pt;mso-wrap-distance-bottom:0;mso-position-horizontal:left;mso-position-horizontal-relative:margin;mso-position-vertical:absolute;mso-position-vertical-relative:text;mso-width-percent:0;mso-height-percent:0;mso-width-relative:margin;mso-height-relative:margin;v-text-anchor:middle" o:gfxdata="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" fillcolor="black [3200]" strokecolor="black [480]" strokeweight="1pt">
                 <v:textbox>
                   <w:txbxContent>
                     <w:p>
@@ -29715,6 +29843,7 @@
                     </w:p>
                   </w:txbxContent>
                 </v:textbox>
+                <w10:wrap anchorx="margin"/>
               </v:rect>
             </w:pict>
           </mc:Fallback>
@@ -29765,8 +29894,6 @@
         <w:jc w:val="both"/>
         <w:rPr>
           <w:rFonts w:asciiTheme="majorBidi" w:hAnsiTheme="majorBidi" w:cstheme="majorBidi"/>
-          <w:sz w:val="28"/>
-          <w:szCs w:val="28"/>
         </w:rPr>
       </w:pPr>
     </w:p>
@@ -29815,6 +29942,7 @@
         <w:t>key=</w:t>
       </w:r>
       <w:proofErr w:type="spellStart"/>
+      <w:proofErr w:type="gramStart"/>
       <w:r>
         <w:rPr>
           <w:rFonts w:asciiTheme="majorBidi" w:hAnsiTheme="majorBidi" w:cstheme="majorBidi"/>
@@ -29828,6 +29956,7 @@
         <w:t>value:NoSchedule</w:t>
       </w:r>
       <w:proofErr w:type="spellEnd"/>
+      <w:proofErr w:type="gramEnd"/>
     </w:p>
     <w:p>
       <w:pPr>
@@ -29924,6 +30053,7 @@
         <w:t xml:space="preserve"> taint node node1 special=</w:t>
       </w:r>
       <w:proofErr w:type="spellStart"/>
+      <w:proofErr w:type="gramStart"/>
       <w:r>
         <w:rPr>
           <w:rFonts w:asciiTheme="majorBidi" w:hAnsiTheme="majorBidi" w:cstheme="majorBidi"/>
@@ -29937,6 +30067,7 @@
         <w:t>true:NoSchedule</w:t>
       </w:r>
       <w:proofErr w:type="spellEnd"/>
+      <w:proofErr w:type="gramEnd"/>
       <w:r>
         <w:rPr>
           <w:rFonts w:asciiTheme="majorBidi" w:hAnsiTheme="majorBidi" w:cstheme="majorBidi"/>
@@ -31236,6 +31367,7 @@
     </w:p>
     <w:p>
       <w:pPr>
+        <w:spacing w:after="120"/>
         <w:jc w:val="both"/>
         <w:rPr>
           <w:rFonts w:asciiTheme="majorBidi" w:hAnsiTheme="majorBidi" w:cstheme="majorBidi"/>
@@ -31426,6 +31558,7 @@
         <w:t>key=</w:t>
       </w:r>
       <w:proofErr w:type="spellStart"/>
+      <w:proofErr w:type="gramStart"/>
       <w:r>
         <w:rPr>
           <w:rFonts w:asciiTheme="majorBidi" w:hAnsiTheme="majorBidi" w:cstheme="majorBidi"/>
@@ -31439,6 +31572,7 @@
         <w:t>value:NoExecute</w:t>
       </w:r>
       <w:proofErr w:type="spellEnd"/>
+      <w:proofErr w:type="gramEnd"/>
     </w:p>
     <w:p>
       <w:pPr>
@@ -32263,6 +32397,7 @@
     </w:p>
     <w:p>
       <w:pPr>
+        <w:spacing w:after="60"/>
         <w:jc w:val="both"/>
         <w:rPr>
           <w:rFonts w:asciiTheme="majorBidi" w:hAnsiTheme="majorBidi" w:cstheme="majorBidi"/>
@@ -32339,24 +32474,26 @@
         <w:jc w:val="both"/>
         <w:rPr>
           <w:rFonts w:asciiTheme="majorBidi" w:hAnsiTheme="majorBidi" w:cstheme="majorBidi"/>
-          <w:sz w:val="28"/>
-          <w:szCs w:val="28"/>
-          <w:u w:val="single"/>
-        </w:rPr>
-      </w:pPr>
-      <w:r>
-        <w:rPr>
-          <w:rFonts w:asciiTheme="majorBidi" w:hAnsiTheme="majorBidi" w:cstheme="majorBidi"/>
-          <w:sz w:val="28"/>
-          <w:szCs w:val="28"/>
-          <w:u w:val="single"/>
+          <w:b/>
+          <w:bCs/>
+          <w:sz w:val="28"/>
+          <w:szCs w:val="28"/>
+        </w:rPr>
+      </w:pPr>
+      <w:r>
+        <w:rPr>
+          <w:rFonts w:asciiTheme="majorBidi" w:hAnsiTheme="majorBidi" w:cstheme="majorBidi"/>
+          <w:b/>
+          <w:bCs/>
+          <w:sz w:val="28"/>
+          <w:szCs w:val="28"/>
         </w:rPr>
         <w:t>Node:</w:t>
       </w:r>
     </w:p>
     <w:p>
       <w:pPr>
-        <w:spacing w:after="120"/>
+        <w:spacing w:after="60"/>
         <w:ind w:left="360"/>
         <w:jc w:val="both"/>
         <w:rPr>
@@ -32382,6 +32519,7 @@
         <w:t>dedicated=</w:t>
       </w:r>
       <w:proofErr w:type="spellStart"/>
+      <w:proofErr w:type="gramStart"/>
       <w:r>
         <w:rPr>
           <w:rFonts w:asciiTheme="majorBidi" w:hAnsiTheme="majorBidi" w:cstheme="majorBidi"/>
@@ -32395,6 +32533,7 @@
         <w:t>db:NoSchedule</w:t>
       </w:r>
       <w:proofErr w:type="spellEnd"/>
+      <w:proofErr w:type="gramEnd"/>
     </w:p>
     <w:p>
       <w:pPr>
@@ -32418,16 +32557,16 @@
         <mc:AlternateContent>
           <mc:Choice Requires="wps">
             <w:drawing>
-              <wp:anchor distT="0" distB="0" distL="114300" distR="114300" simplePos="0" relativeHeight="251681792" behindDoc="0" locked="0" layoutInCell="1" allowOverlap="1" wp14:anchorId="245628AA" wp14:editId="1C792B75">
+              <wp:anchor distT="0" distB="0" distL="114300" distR="114300" simplePos="0" relativeHeight="251681792" behindDoc="0" locked="0" layoutInCell="1" allowOverlap="1" wp14:anchorId="245628AA" wp14:editId="46778190">
                 <wp:simplePos x="0" y="0"/>
                 <wp:positionH relativeFrom="column">
-                  <wp:posOffset>221673</wp:posOffset>
+                  <wp:posOffset>220980</wp:posOffset>
                 </wp:positionH>
                 <wp:positionV relativeFrom="paragraph">
-                  <wp:posOffset>267566</wp:posOffset>
+                  <wp:posOffset>282575</wp:posOffset>
                 </wp:positionV>
-                <wp:extent cx="3262745" cy="1267691"/>
-                <wp:effectExtent l="0" t="0" r="13970" b="27940"/>
+                <wp:extent cx="3262745" cy="1252220"/>
+                <wp:effectExtent l="0" t="0" r="13970" b="24130"/>
                 <wp:wrapNone/>
                 <wp:docPr id="346503866" name="Rectangle 23"/>
                 <wp:cNvGraphicFramePr/>
@@ -32438,7 +32577,7 @@
                       <wps:spPr>
                         <a:xfrm>
                           <a:off x="0" y="0"/>
-                          <a:ext cx="3262745" cy="1267691"/>
+                          <a:ext cx="3262745" cy="1252220"/>
                         </a:xfrm>
                         <a:prstGeom prst="rect">
                           <a:avLst/>
@@ -32726,7 +32865,7 @@
           </mc:Choice>
           <mc:Fallback>
             <w:pict>
-              <v:rect w14:anchorId="245628AA" id="Rectangle 23" o:spid="_x0000_s1048" style="position:absolute;left:0;text-align:left;margin-left:17.45pt;margin-top:21.05pt;width:256.9pt;height:99.8pt;z-index:251681792;visibility:visible;mso-wrap-style:square;mso-width-percent:0;mso-height-percent:0;mso-wrap-distance-left:9pt;mso-wrap-distance-top:0;mso-wrap-distance-right:9pt;mso-wrap-distance-bottom:0;mso-position-horizontal:absolute;mso-position-horizontal-relative:text;mso-position-vertical:absolute;mso-position-vertical-relative:text;mso-width-percent:0;mso-height-percent:0;mso-width-relative:margin;mso-height-relative:margin;v-text-anchor:middle" o:gfxdata="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" fillcolor="black [3200]" strokecolor="black [480]" strokeweight="1pt">
+              <v:rect w14:anchorId="245628AA" id="Rectangle 23" o:spid="_x0000_s1048" style="position:absolute;left:0;text-align:left;margin-left:17.4pt;margin-top:22.25pt;width:256.9pt;height:98.6pt;z-index:251681792;visibility:visible;mso-wrap-style:square;mso-width-percent:0;mso-height-percent:0;mso-wrap-distance-left:9pt;mso-wrap-distance-top:0;mso-wrap-distance-right:9pt;mso-wrap-distance-bottom:0;mso-position-horizontal:absolute;mso-position-horizontal-relative:text;mso-position-vertical:absolute;mso-position-vertical-relative:text;mso-width-percent:0;mso-height-percent:0;mso-width-relative:margin;mso-height-relative:margin;v-text-anchor:middle" o:gfxdata="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" fillcolor="black [3200]" strokecolor="black [480]" strokeweight="1pt">
                 <v:textbox>
                   <w:txbxContent>
                     <w:p>
@@ -33153,9 +33292,23 @@
           <w:sz w:val="28"/>
           <w:szCs w:val="28"/>
         </w:rPr>
-        <w:t>control-plane:NoSchedule</w:t>
+        <w:t>control-</w:t>
+      </w:r>
+      <w:proofErr w:type="gramStart"/>
+      <w:r>
+        <w:rPr>
+          <w:rFonts w:asciiTheme="majorBidi" w:hAnsiTheme="majorBidi" w:cstheme="majorBidi"/>
+          <w:b/>
+          <w:bCs/>
+          <w:i/>
+          <w:iCs/>
+          <w:sz w:val="28"/>
+          <w:szCs w:val="28"/>
+        </w:rPr>
+        <w:t>plane:NoSchedule</w:t>
       </w:r>
       <w:proofErr w:type="spellEnd"/>
+      <w:proofErr w:type="gramEnd"/>
       <w:r>
         <w:rPr>
           <w:rFonts w:asciiTheme="majorBidi" w:hAnsiTheme="majorBidi" w:cstheme="majorBidi"/>
@@ -33284,6 +33437,7 @@
         <w:t>=</w:t>
       </w:r>
       <w:proofErr w:type="spellStart"/>
+      <w:proofErr w:type="gramStart"/>
       <w:r>
         <w:rPr>
           <w:rFonts w:asciiTheme="majorBidi" w:hAnsiTheme="majorBidi" w:cstheme="majorBidi"/>
@@ -33297,6 +33451,7 @@
         <w:t>true:NoSchedule</w:t>
       </w:r>
       <w:proofErr w:type="spellEnd"/>
+      <w:proofErr w:type="gramEnd"/>
       <w:r>
         <w:rPr>
           <w:rFonts w:asciiTheme="majorBidi" w:hAnsiTheme="majorBidi" w:cstheme="majorBidi"/>
@@ -33413,6 +33568,7 @@
         <w:t xml:space="preserve"> taint node node1 maintenance=</w:t>
       </w:r>
       <w:proofErr w:type="spellStart"/>
+      <w:proofErr w:type="gramStart"/>
       <w:r>
         <w:rPr>
           <w:rFonts w:asciiTheme="majorBidi" w:hAnsiTheme="majorBidi" w:cstheme="majorBidi"/>
@@ -33426,6 +33582,7 @@
         <w:t>true:NoExecute</w:t>
       </w:r>
       <w:proofErr w:type="spellEnd"/>
+      <w:proofErr w:type="gramEnd"/>
     </w:p>
     <w:p>
       <w:pPr>
@@ -33922,6 +34079,7 @@
         </w:rPr>
         <w:t xml:space="preserve">Taints appear in their own dedicated section called </w:t>
       </w:r>
+      <w:proofErr w:type="gramStart"/>
       <w:r>
         <w:rPr>
           <w:rFonts w:asciiTheme="majorBidi" w:hAnsiTheme="majorBidi" w:cstheme="majorBidi"/>
@@ -33940,7 +34098,16 @@
           <w:sz w:val="28"/>
           <w:szCs w:val="28"/>
         </w:rPr>
-        <w:t>, usually near the bottom of the main summary block.</w:t>
+        <w:t>,</w:t>
+      </w:r>
+      <w:proofErr w:type="gramEnd"/>
+      <w:r>
+        <w:rPr>
+          <w:rFonts w:asciiTheme="majorBidi" w:hAnsiTheme="majorBidi" w:cstheme="majorBidi"/>
+          <w:sz w:val="28"/>
+          <w:szCs w:val="28"/>
+        </w:rPr>
+        <w:t xml:space="preserve"> usually near the bottom of the main summary block.</w:t>
       </w:r>
     </w:p>
     <w:p>
@@ -34487,6 +34654,7 @@
                               <w:t>special=</w:t>
                             </w:r>
                             <w:proofErr w:type="spellStart"/>
+                            <w:proofErr w:type="gramStart"/>
                             <w:r>
                               <w:rPr>
                                 <w:rFonts w:asciiTheme="majorBidi" w:hAnsiTheme="majorBidi" w:cstheme="majorBidi"/>
@@ -34500,6 +34668,7 @@
                               <w:t>true:NoSchedule</w:t>
                             </w:r>
                             <w:proofErr w:type="spellEnd"/>
+                            <w:proofErr w:type="gramEnd"/>
                           </w:p>
                           <w:p>
                             <w:pPr>
@@ -34548,8 +34717,22 @@
                                 <w:sz w:val="28"/>
                                 <w:szCs w:val="28"/>
                               </w:rPr>
-                              <w:t>key1=value1:NoExecute</w:t>
+                              <w:t>key1=value</w:t>
                             </w:r>
+                            <w:proofErr w:type="gramStart"/>
+                            <w:r>
+                              <w:rPr>
+                                <w:rFonts w:asciiTheme="majorBidi" w:hAnsiTheme="majorBidi" w:cstheme="majorBidi"/>
+                                <w:b/>
+                                <w:bCs/>
+                                <w:i/>
+                                <w:iCs/>
+                                <w:sz w:val="28"/>
+                                <w:szCs w:val="28"/>
+                              </w:rPr>
+                              <w:t>1:NoExecute</w:t>
+                            </w:r>
+                            <w:proofErr w:type="gramEnd"/>
                           </w:p>
                           <w:p>
                             <w:pPr>
@@ -34601,6 +34784,7 @@
                               <w:t>dedicated=</w:t>
                             </w:r>
                             <w:proofErr w:type="spellStart"/>
+                            <w:proofErr w:type="gramStart"/>
                             <w:r>
                               <w:rPr>
                                 <w:rFonts w:asciiTheme="majorBidi" w:hAnsiTheme="majorBidi" w:cstheme="majorBidi"/>
@@ -34614,6 +34798,7 @@
                               <w:t>db:PreferNoSchedule</w:t>
                             </w:r>
                             <w:proofErr w:type="spellEnd"/>
+                            <w:proofErr w:type="gramEnd"/>
                           </w:p>
                           <w:p>
                             <w:pPr>
@@ -35726,6 +35911,7 @@
         <w:t xml:space="preserve"> taint node worker-1 env=</w:t>
       </w:r>
       <w:proofErr w:type="spellStart"/>
+      <w:proofErr w:type="gramStart"/>
       <w:r>
         <w:rPr>
           <w:rFonts w:asciiTheme="majorBidi" w:hAnsiTheme="majorBidi" w:cstheme="majorBidi"/>
@@ -35739,6 +35925,7 @@
         <w:t>prod:NoSchedule</w:t>
       </w:r>
       <w:proofErr w:type="spellEnd"/>
+      <w:proofErr w:type="gramEnd"/>
     </w:p>
     <w:p>
       <w:pPr>
@@ -35747,6 +35934,7 @@
           <w:ilvl w:val="0"/>
           <w:numId w:val="69"/>
         </w:numPr>
+        <w:spacing w:after="120"/>
         <w:ind w:left="360"/>
         <w:rPr>
           <w:rFonts w:asciiTheme="majorBidi" w:hAnsiTheme="majorBidi" w:cstheme="majorBidi"/>
@@ -35797,6 +35985,7 @@
         <w:t xml:space="preserve"> taint node worker-1 env=</w:t>
       </w:r>
       <w:proofErr w:type="spellStart"/>
+      <w:proofErr w:type="gramStart"/>
       <w:r>
         <w:rPr>
           <w:rFonts w:asciiTheme="majorBidi" w:hAnsiTheme="majorBidi" w:cstheme="majorBidi"/>
@@ -35810,6 +35999,7 @@
         <w:t>prod:NoSchedule</w:t>
       </w:r>
       <w:proofErr w:type="spellEnd"/>
+      <w:proofErr w:type="gramEnd"/>
       <w:r>
         <w:rPr>
           <w:rFonts w:asciiTheme="majorBidi" w:hAnsiTheme="majorBidi" w:cstheme="majorBidi"/>
@@ -36603,8 +36793,22 @@
           <w:sz w:val="28"/>
           <w:szCs w:val="28"/>
         </w:rPr>
-        <w:t>node.kubernetes.io/not-ready:NoSchedule</w:t>
-      </w:r>
+        <w:t>node.kubernetes.io/not-</w:t>
+      </w:r>
+      <w:proofErr w:type="gramStart"/>
+      <w:r>
+        <w:rPr>
+          <w:rFonts w:asciiTheme="majorBidi" w:hAnsiTheme="majorBidi" w:cstheme="majorBidi"/>
+          <w:b/>
+          <w:bCs/>
+          <w:i/>
+          <w:iCs/>
+          <w:sz w:val="28"/>
+          <w:szCs w:val="28"/>
+        </w:rPr>
+        <w:t>ready:NoSchedule</w:t>
+      </w:r>
+      <w:proofErr w:type="gramEnd"/>
     </w:p>
     <w:p>
       <w:pPr>
@@ -36638,6 +36842,7 @@
         <w:t>node.kubernetes.io/</w:t>
       </w:r>
       <w:proofErr w:type="spellStart"/>
+      <w:proofErr w:type="gramStart"/>
       <w:r>
         <w:rPr>
           <w:rFonts w:asciiTheme="majorBidi" w:hAnsiTheme="majorBidi" w:cstheme="majorBidi"/>
@@ -36651,6 +36856,7 @@
         <w:t>unreachable:NoSchedule</w:t>
       </w:r>
       <w:proofErr w:type="spellEnd"/>
+      <w:proofErr w:type="gramEnd"/>
     </w:p>
     <w:p>
       <w:pPr>

</xml_diff>